<commit_message>
Pruebas de caja Negra
</commit_message>
<xml_diff>
--- a/Proyecto/docs/ADS_Proyecto_EstructuraMonolitica_AndresFabara_JoshuaOsorio.docx
+++ b/Proyecto/docs/ADS_Proyecto_EstructuraMonolitica_AndresFabara_JoshuaOsorio.docx
@@ -496,10 +496,12 @@
           <w:r>
             <w:fldChar w:fldCharType="separate"/>
           </w:r>
-          <w:hyperlink w:anchor="_Toc222087911" w:history="1">
+          <w:hyperlink w:anchor="_Toc229074939" w:history="1">
             <w:r>
               <w:rPr>
                 <w:rStyle w:val="Hipervnculo"/>
+                <w:b/>
+                <w:bCs/>
                 <w:noProof/>
                 <w:lang w:val="es-ES"/>
               </w:rPr>
@@ -524,7 +526,7 @@
                 <w:noProof/>
                 <w:webHidden/>
               </w:rPr>
-              <w:instrText xml:space="preserve"> PAGEREF _Toc222087911 \h </w:instrText>
+              <w:instrText xml:space="preserve"> PAGEREF _Toc229074939 \h </w:instrText>
             </w:r>
             <w:r>
               <w:rPr>
@@ -571,14 +573,16 @@
               <w14:ligatures w14:val="standardContextual"/>
             </w:rPr>
           </w:pPr>
-          <w:hyperlink w:anchor="_Toc222087912" w:history="1">
+          <w:hyperlink w:anchor="_Toc229074940" w:history="1">
             <w:r>
               <w:rPr>
                 <w:rStyle w:val="Hipervnculo"/>
+                <w:b/>
+                <w:bCs/>
                 <w:noProof/>
                 <w:lang w:val="es-ES"/>
               </w:rPr>
-              <w:t>Objetivo del sistema</w:t>
+              <w:t>Arquitectura Seleccionada</w:t>
             </w:r>
             <w:r>
               <w:rPr>
@@ -599,241 +603,7 @@
                 <w:noProof/>
                 <w:webHidden/>
               </w:rPr>
-              <w:instrText xml:space="preserve"> PAGEREF _Toc222087912 \h </w:instrText>
-            </w:r>
-            <w:r>
-              <w:rPr>
-                <w:noProof/>
-                <w:webHidden/>
-              </w:rPr>
-            </w:r>
-            <w:r>
-              <w:rPr>
-                <w:noProof/>
-                <w:webHidden/>
-              </w:rPr>
-              <w:fldChar w:fldCharType="separate"/>
-            </w:r>
-            <w:r>
-              <w:rPr>
-                <w:b/>
-                <w:bCs/>
-                <w:noProof/>
-                <w:webHidden/>
-                <w:lang w:val="es-ES"/>
-              </w:rPr>
-              <w:t>¡Error! Marcador no definido.</w:t>
-            </w:r>
-            <w:r>
-              <w:rPr>
-                <w:noProof/>
-                <w:webHidden/>
-              </w:rPr>
-              <w:fldChar w:fldCharType="end"/>
-            </w:r>
-          </w:hyperlink>
-        </w:p>
-        <w:p>
-          <w:pPr>
-            <w:pStyle w:val="TDC2"/>
-            <w:tabs>
-              <w:tab w:val="right" w:leader="dot" w:pos="9350"/>
-            </w:tabs>
-            <w:rPr>
-              <w:rFonts w:asciiTheme="minorHAnsi" w:eastAsiaTheme="minorEastAsia" w:hAnsiTheme="minorHAnsi" w:cstheme="minorBidi"/>
-              <w:noProof/>
-              <w:kern w:val="2"/>
-              <w:sz w:val="24"/>
-              <w:szCs w:val="24"/>
-              <w:lang w:val="en-US"/>
-              <w14:ligatures w14:val="standardContextual"/>
-            </w:rPr>
-          </w:pPr>
-          <w:hyperlink w:anchor="_Toc222087913" w:history="1">
-            <w:r>
-              <w:rPr>
-                <w:rStyle w:val="Hipervnculo"/>
-                <w:noProof/>
-                <w:lang w:val="es-ES"/>
-              </w:rPr>
-              <w:t>Principales usuarios o actores involucrados</w:t>
-            </w:r>
-            <w:r>
-              <w:rPr>
-                <w:noProof/>
-                <w:webHidden/>
-              </w:rPr>
-              <w:tab/>
-            </w:r>
-            <w:r>
-              <w:rPr>
-                <w:noProof/>
-                <w:webHidden/>
-              </w:rPr>
-              <w:fldChar w:fldCharType="begin"/>
-            </w:r>
-            <w:r>
-              <w:rPr>
-                <w:noProof/>
-                <w:webHidden/>
-              </w:rPr>
-              <w:instrText xml:space="preserve"> PAGEREF _Toc222087913 \h </w:instrText>
-            </w:r>
-            <w:r>
-              <w:rPr>
-                <w:noProof/>
-                <w:webHidden/>
-              </w:rPr>
-            </w:r>
-            <w:r>
-              <w:rPr>
-                <w:noProof/>
-                <w:webHidden/>
-              </w:rPr>
-              <w:fldChar w:fldCharType="separate"/>
-            </w:r>
-            <w:r>
-              <w:rPr>
-                <w:b/>
-                <w:bCs/>
-                <w:noProof/>
-                <w:webHidden/>
-                <w:lang w:val="es-ES"/>
-              </w:rPr>
-              <w:t>¡Error! Marcador no definido.</w:t>
-            </w:r>
-            <w:r>
-              <w:rPr>
-                <w:noProof/>
-                <w:webHidden/>
-              </w:rPr>
-              <w:fldChar w:fldCharType="end"/>
-            </w:r>
-          </w:hyperlink>
-        </w:p>
-        <w:p>
-          <w:pPr>
-            <w:pStyle w:val="TDC2"/>
-            <w:tabs>
-              <w:tab w:val="right" w:leader="dot" w:pos="9350"/>
-            </w:tabs>
-            <w:rPr>
-              <w:rFonts w:asciiTheme="minorHAnsi" w:eastAsiaTheme="minorEastAsia" w:hAnsiTheme="minorHAnsi" w:cstheme="minorBidi"/>
-              <w:noProof/>
-              <w:kern w:val="2"/>
-              <w:sz w:val="24"/>
-              <w:szCs w:val="24"/>
-              <w:lang w:val="en-US"/>
-              <w14:ligatures w14:val="standardContextual"/>
-            </w:rPr>
-          </w:pPr>
-          <w:hyperlink w:anchor="_Toc222087914" w:history="1">
-            <w:r>
-              <w:rPr>
-                <w:rStyle w:val="Hipervnculo"/>
-                <w:noProof/>
-                <w:lang w:val="es-ES"/>
-              </w:rPr>
-              <w:t>Principales funciones del sistema</w:t>
-            </w:r>
-            <w:r>
-              <w:rPr>
-                <w:noProof/>
-                <w:webHidden/>
-              </w:rPr>
-              <w:tab/>
-            </w:r>
-            <w:r>
-              <w:rPr>
-                <w:noProof/>
-                <w:webHidden/>
-              </w:rPr>
-              <w:fldChar w:fldCharType="begin"/>
-            </w:r>
-            <w:r>
-              <w:rPr>
-                <w:noProof/>
-                <w:webHidden/>
-              </w:rPr>
-              <w:instrText xml:space="preserve"> PAGEREF _Toc222087914 \h </w:instrText>
-            </w:r>
-            <w:r>
-              <w:rPr>
-                <w:noProof/>
-                <w:webHidden/>
-              </w:rPr>
-            </w:r>
-            <w:r>
-              <w:rPr>
-                <w:noProof/>
-                <w:webHidden/>
-              </w:rPr>
-              <w:fldChar w:fldCharType="separate"/>
-            </w:r>
-            <w:r>
-              <w:rPr>
-                <w:b/>
-                <w:bCs/>
-                <w:noProof/>
-                <w:webHidden/>
-                <w:lang w:val="es-ES"/>
-              </w:rPr>
-              <w:t>¡Error! Marcador no definido.</w:t>
-            </w:r>
-            <w:r>
-              <w:rPr>
-                <w:noProof/>
-                <w:webHidden/>
-              </w:rPr>
-              <w:fldChar w:fldCharType="end"/>
-            </w:r>
-          </w:hyperlink>
-        </w:p>
-        <w:p>
-          <w:pPr>
-            <w:pStyle w:val="TDC2"/>
-            <w:tabs>
-              <w:tab w:val="right" w:leader="dot" w:pos="9350"/>
-            </w:tabs>
-            <w:rPr>
-              <w:rFonts w:asciiTheme="minorHAnsi" w:eastAsiaTheme="minorEastAsia" w:hAnsiTheme="minorHAnsi" w:cstheme="minorBidi"/>
-              <w:noProof/>
-              <w:kern w:val="2"/>
-              <w:sz w:val="24"/>
-              <w:szCs w:val="24"/>
-              <w:lang w:val="en-US"/>
-              <w14:ligatures w14:val="standardContextual"/>
-            </w:rPr>
-          </w:pPr>
-          <w:hyperlink w:anchor="_Toc222087915" w:history="1">
-            <w:r>
-              <w:rPr>
-                <w:rStyle w:val="Hipervnculo"/>
-                <w:noProof/>
-                <w:lang w:val="es-ES"/>
-              </w:rPr>
-              <w:t>Entorno de operación</w:t>
-            </w:r>
-            <w:r>
-              <w:rPr>
-                <w:noProof/>
-                <w:webHidden/>
-              </w:rPr>
-              <w:tab/>
-            </w:r>
-            <w:r>
-              <w:rPr>
-                <w:noProof/>
-                <w:webHidden/>
-              </w:rPr>
-              <w:fldChar w:fldCharType="begin"/>
-            </w:r>
-            <w:r>
-              <w:rPr>
-                <w:noProof/>
-                <w:webHidden/>
-              </w:rPr>
-              <w:instrText xml:space="preserve"> PAGEREF _Toc222087915 \h </w:instrText>
+              <w:instrText xml:space="preserve"> PAGEREF _Toc229074940 \h </w:instrText>
             </w:r>
             <w:r>
               <w:rPr>
@@ -866,7 +636,7 @@
         </w:p>
         <w:p>
           <w:pPr>
-            <w:pStyle w:val="TDC2"/>
+            <w:pStyle w:val="TDC3"/>
             <w:tabs>
               <w:tab w:val="right" w:leader="dot" w:pos="9350"/>
             </w:tabs>
@@ -880,14 +650,15 @@
               <w14:ligatures w14:val="standardContextual"/>
             </w:rPr>
           </w:pPr>
-          <w:hyperlink w:anchor="_Toc222087916" w:history="1">
+          <w:hyperlink w:anchor="_Toc229074941" w:history="1">
             <w:r>
               <w:rPr>
                 <w:rStyle w:val="Hipervnculo"/>
+                <w:b/>
+                <w:bCs/>
                 <w:noProof/>
-                <w:lang w:val="es-ES"/>
               </w:rPr>
-              <w:t>Posibles herramientas de desarrollo</w:t>
+              <w:t>Justificación de la elección</w:t>
             </w:r>
             <w:r>
               <w:rPr>
@@ -908,7 +679,7 @@
                 <w:noProof/>
                 <w:webHidden/>
               </w:rPr>
-              <w:instrText xml:space="preserve"> PAGEREF _Toc222087916 \h </w:instrText>
+              <w:instrText xml:space="preserve"> PAGEREF _Toc229074941 \h </w:instrText>
             </w:r>
             <w:r>
               <w:rPr>
@@ -929,84 +700,6 @@
                 <w:webHidden/>
               </w:rPr>
               <w:t>2</w:t>
-            </w:r>
-            <w:r>
-              <w:rPr>
-                <w:noProof/>
-                <w:webHidden/>
-              </w:rPr>
-              <w:fldChar w:fldCharType="end"/>
-            </w:r>
-          </w:hyperlink>
-        </w:p>
-        <w:p>
-          <w:pPr>
-            <w:pStyle w:val="TDC1"/>
-            <w:tabs>
-              <w:tab w:val="right" w:leader="dot" w:pos="9350"/>
-            </w:tabs>
-            <w:rPr>
-              <w:rFonts w:asciiTheme="minorHAnsi" w:eastAsiaTheme="minorEastAsia" w:hAnsiTheme="minorHAnsi" w:cstheme="minorBidi"/>
-              <w:noProof/>
-              <w:kern w:val="2"/>
-              <w:sz w:val="24"/>
-              <w:szCs w:val="24"/>
-              <w:lang w:val="en-US"/>
-              <w14:ligatures w14:val="standardContextual"/>
-            </w:rPr>
-          </w:pPr>
-          <w:hyperlink w:anchor="_Toc222087917" w:history="1">
-            <w:r>
-              <w:rPr>
-                <w:rStyle w:val="Hipervnculo"/>
-                <w:rFonts w:ascii="Proxima Nova" w:eastAsia="Proxima Nova" w:hAnsi="Proxima Nova" w:cs="Proxima Nova"/>
-                <w:noProof/>
-              </w:rPr>
-              <w:t>Conclusiones</w:t>
-            </w:r>
-            <w:r>
-              <w:rPr>
-                <w:noProof/>
-                <w:webHidden/>
-              </w:rPr>
-              <w:tab/>
-            </w:r>
-            <w:r>
-              <w:rPr>
-                <w:noProof/>
-                <w:webHidden/>
-              </w:rPr>
-              <w:fldChar w:fldCharType="begin"/>
-            </w:r>
-            <w:r>
-              <w:rPr>
-                <w:noProof/>
-                <w:webHidden/>
-              </w:rPr>
-              <w:instrText xml:space="preserve"> PAGEREF _Toc222087917 \h </w:instrText>
-            </w:r>
-            <w:r>
-              <w:rPr>
-                <w:noProof/>
-                <w:webHidden/>
-              </w:rPr>
-            </w:r>
-            <w:r>
-              <w:rPr>
-                <w:noProof/>
-                <w:webHidden/>
-              </w:rPr>
-              <w:fldChar w:fldCharType="separate"/>
-            </w:r>
-            <w:r>
-              <w:rPr>
-                <w:b/>
-                <w:bCs/>
-                <w:noProof/>
-                <w:webHidden/>
-                <w:lang w:val="es-ES"/>
-              </w:rPr>
-              <w:t>¡Error! Marcador no definido.</w:t>
             </w:r>
             <w:r>
               <w:rPr>
@@ -1062,7 +755,7 @@
           <w:bCs/>
         </w:rPr>
       </w:pPr>
-      <w:bookmarkStart w:id="9" w:name="_Toc222087911"/>
+      <w:bookmarkStart w:id="9" w:name="_Toc229074939"/>
       <w:r>
         <w:rPr>
           <w:b/>
@@ -1172,7 +865,7 @@
           <w:bCs/>
         </w:rPr>
       </w:pPr>
-      <w:bookmarkStart w:id="10" w:name="_Toc222087915"/>
+      <w:bookmarkStart w:id="10" w:name="_Toc229074940"/>
       <w:r>
         <w:rPr>
           <w:b/>
@@ -1181,6 +874,7 @@
         </w:rPr>
         <w:t>Arquitectura Seleccionada</w:t>
       </w:r>
+      <w:bookmarkEnd w:id="10"/>
     </w:p>
     <w:p>
       <w:pPr>
@@ -1209,8 +903,7 @@
           <w:color w:val="auto"/>
         </w:rPr>
       </w:pPr>
-      <w:bookmarkStart w:id="11" w:name="_Toc222087916"/>
-      <w:bookmarkEnd w:id="10"/>
+      <w:bookmarkStart w:id="11" w:name="_Toc229074941"/>
       <w:r>
         <w:rPr>
           <w:b/>
@@ -1219,6 +912,7 @@
         </w:rPr>
         <w:t>Justificación de la elección</w:t>
       </w:r>
+      <w:bookmarkEnd w:id="11"/>
     </w:p>
     <w:p>
       <w:pPr>
@@ -1278,7 +972,6 @@
           <w:bCs/>
           <w:lang w:val="es-MX"/>
         </w:rPr>
-        <w:lastRenderedPageBreak/>
         <w:t>Herramientas de desarrollo:</w:t>
       </w:r>
       <w:r>
@@ -1418,10 +1111,18 @@
           <w:rFonts w:ascii="Arial" w:hAnsi="Arial" w:cs="Arial"/>
           <w:lang w:val="es-MX"/>
         </w:rPr>
-        <w:t xml:space="preserve"> es directa y robusta dentro de esta arquitectura, permitiendo un manejo rápido para el registro de ventas y el control básico de inventario</w:t>
+        <w:t xml:space="preserve"> es directa y robusta dentro de esta arquitectura, </w:t>
+      </w:r>
+      <w:r>
+        <w:rPr>
+          <w:rStyle w:val="citation-57"/>
+          <w:rFonts w:ascii="Arial" w:hAnsi="Arial" w:cs="Arial"/>
+          <w:lang w:val="es-MX"/>
+        </w:rPr>
+        <w:lastRenderedPageBreak/>
+        <w:t>permitiendo un manejo rápido para el registro de ventas y el control básico de inventario</w:t>
       </w:r>
     </w:p>
-    <w:bookmarkEnd w:id="11"/>
     <w:p>
       <w:pPr>
         <w:spacing w:line="480" w:lineRule="auto"/>

</xml_diff>